<commit_message>
TMLR submission package: final cover letter (author name, exploratory/descriptive statements), rebuilt cover artifacts, checklist
</commit_message>
<xml_diff>
--- a/papers/docx/COVER_LETTER.docx
+++ b/papers/docx/COVER_LETTER.docx
@@ -60,7 +60,7 @@
           <w:rFonts w:ascii="Times New Roman" w:hAnsi="Times New Roman" w:eastAsia="Times New Roman"/>
           <w:sz w:val="21"/>
         </w:rPr>
-        <w:t xml:space="preserve"> 2026-08-02 </w:t>
+        <w:t xml:space="preserve"> 2026-08-08 </w:t>
       </w:r>
       <w:r>
         <w:rPr>
@@ -268,6 +268,15 @@
           <w:sz w:val="21"/>
         </w:rPr>
         <w:t>positive results. They are not presented as architecture-level comparisons against full ReAct, Reflexion, Voyager, or MetaGPT implementations.</w:t>
+      </w:r>
+    </w:p>
+    <w:p>
+      <w:r>
+        <w:rPr>
+          <w:rFonts w:ascii="Times New Roman" w:hAnsi="Times New Roman" w:eastAsia="Times New Roman"/>
+          <w:sz w:val="21"/>
+        </w:rPr>
+        <w:t>The 6-scenario prompt-template comparison in Section 7.5 is explicitly presented as exploratory and descriptive: it is not a statistically supported architecture comparison. The historical three-run summary in Section 4.3 is presented as descriptive only, and the manuscript makes no confidence-interval, power, or superiority claim from it.</w:t>
       </w:r>
     </w:p>
     <w:p>

</xml_diff>